<commit_message>
docs: insert Zenodo DOIs and finalize citation metadata for v1.0
- Add framework DOI 10.5281/zenodo.21330159 to all how-to-cite lines,
  README badge/citation, CITATION.cff, NOTICE, and CC-BY attribution
- Update Case Study and Conference Outline references to full citations
  with repository DOI 10.5281/zenodo.21330842
- Set repository-code to https://github.com/Conefia/safe-care
- Re-export all 10 branded DOCX/PDF release assets with DOIs
- Check off DOI items in the publication checklist and changelog
</commit_message>
<xml_diff>
--- a/release_assets/docx/01_SAFE-CARE_One_Pager.docx
+++ b/release_assets/docx/01_SAFE-CARE_One_Pager.docx
@@ -73,8 +73,8 @@
         </w:tblBorders>
       </w:tblPr>
       <w:tblGrid>
-        <w:gridCol w:w="4680"/>
-        <w:gridCol w:w="4680"/>
+        <w:gridCol w:w="2550"/>
+        <w:gridCol w:w="6810"/>
       </w:tblGrid>
       <w:tr>
         <w:trPr>
@@ -82,7 +82,7 @@
         </w:trPr>
         <w:tc>
           <w:tcPr>
-            <w:tcW w:type="dxa" w:w="4680"/>
+            <w:tcW w:type="dxa" w:w="2550"/>
             <w:tcBorders>
               <w:top w:val="single" w:color="D0D0CE" w:sz="1"/>
               <w:left w:val="single" w:color="D0D0CE" w:sz="1"/>
@@ -115,7 +115,7 @@
         </w:tc>
         <w:tc>
           <w:tcPr>
-            <w:tcW w:type="dxa" w:w="4680"/>
+            <w:tcW w:type="dxa" w:w="6810"/>
             <w:tcBorders>
               <w:top w:val="single" w:color="D0D0CE" w:sz="1"/>
               <w:left w:val="single" w:color="D0D0CE" w:sz="1"/>
@@ -150,7 +150,7 @@
       <w:tr>
         <w:tc>
           <w:tcPr>
-            <w:tcW w:type="dxa" w:w="4680"/>
+            <w:tcW w:type="dxa" w:w="2550"/>
             <w:tcBorders>
               <w:top w:val="single" w:color="D0D0CE" w:sz="1"/>
               <w:left w:val="single" w:color="D0D0CE" w:sz="1"/>
@@ -176,7 +176,7 @@
         </w:tc>
         <w:tc>
           <w:tcPr>
-            <w:tcW w:type="dxa" w:w="4680"/>
+            <w:tcW w:type="dxa" w:w="6810"/>
             <w:tcBorders>
               <w:top w:val="single" w:color="D0D0CE" w:sz="1"/>
               <w:left w:val="single" w:color="D0D0CE" w:sz="1"/>
@@ -204,7 +204,7 @@
       <w:tr>
         <w:tc>
           <w:tcPr>
-            <w:tcW w:type="dxa" w:w="4680"/>
+            <w:tcW w:type="dxa" w:w="2550"/>
             <w:tcBorders>
               <w:top w:val="single" w:color="D0D0CE" w:sz="1"/>
               <w:left w:val="single" w:color="D0D0CE" w:sz="1"/>
@@ -230,7 +230,7 @@
         </w:tc>
         <w:tc>
           <w:tcPr>
-            <w:tcW w:type="dxa" w:w="4680"/>
+            <w:tcW w:type="dxa" w:w="6810"/>
             <w:tcBorders>
               <w:top w:val="single" w:color="D0D0CE" w:sz="1"/>
               <w:left w:val="single" w:color="D0D0CE" w:sz="1"/>
@@ -258,7 +258,7 @@
       <w:tr>
         <w:tc>
           <w:tcPr>
-            <w:tcW w:type="dxa" w:w="4680"/>
+            <w:tcW w:type="dxa" w:w="2550"/>
             <w:tcBorders>
               <w:top w:val="single" w:color="D0D0CE" w:sz="1"/>
               <w:left w:val="single" w:color="D0D0CE" w:sz="1"/>
@@ -284,7 +284,7 @@
         </w:tc>
         <w:tc>
           <w:tcPr>
-            <w:tcW w:type="dxa" w:w="4680"/>
+            <w:tcW w:type="dxa" w:w="6810"/>
             <w:tcBorders>
               <w:top w:val="single" w:color="D0D0CE" w:sz="1"/>
               <w:left w:val="single" w:color="D0D0CE" w:sz="1"/>
@@ -312,7 +312,7 @@
       <w:tr>
         <w:tc>
           <w:tcPr>
-            <w:tcW w:type="dxa" w:w="4680"/>
+            <w:tcW w:type="dxa" w:w="2550"/>
             <w:tcBorders>
               <w:top w:val="single" w:color="D0D0CE" w:sz="1"/>
               <w:left w:val="single" w:color="D0D0CE" w:sz="1"/>
@@ -338,7 +338,7 @@
         </w:tc>
         <w:tc>
           <w:tcPr>
-            <w:tcW w:type="dxa" w:w="4680"/>
+            <w:tcW w:type="dxa" w:w="6810"/>
             <w:tcBorders>
               <w:top w:val="single" w:color="D0D0CE" w:sz="1"/>
               <w:left w:val="single" w:color="D0D0CE" w:sz="1"/>
@@ -366,7 +366,7 @@
       <w:tr>
         <w:tc>
           <w:tcPr>
-            <w:tcW w:type="dxa" w:w="4680"/>
+            <w:tcW w:type="dxa" w:w="2550"/>
             <w:tcBorders>
               <w:top w:val="single" w:color="D0D0CE" w:sz="1"/>
               <w:left w:val="single" w:color="D0D0CE" w:sz="1"/>
@@ -392,7 +392,7 @@
         </w:tc>
         <w:tc>
           <w:tcPr>
-            <w:tcW w:type="dxa" w:w="4680"/>
+            <w:tcW w:type="dxa" w:w="6810"/>
             <w:tcBorders>
               <w:top w:val="single" w:color="D0D0CE" w:sz="1"/>
               <w:left w:val="single" w:color="D0D0CE" w:sz="1"/>
@@ -420,7 +420,7 @@
       <w:tr>
         <w:tc>
           <w:tcPr>
-            <w:tcW w:type="dxa" w:w="4680"/>
+            <w:tcW w:type="dxa" w:w="2550"/>
             <w:tcBorders>
               <w:top w:val="single" w:color="D0D0CE" w:sz="1"/>
               <w:left w:val="single" w:color="D0D0CE" w:sz="1"/>
@@ -446,7 +446,7 @@
         </w:tc>
         <w:tc>
           <w:tcPr>
-            <w:tcW w:type="dxa" w:w="4680"/>
+            <w:tcW w:type="dxa" w:w="6810"/>
             <w:tcBorders>
               <w:top w:val="single" w:color="D0D0CE" w:sz="1"/>
               <w:left w:val="single" w:color="D0D0CE" w:sz="1"/>
@@ -474,7 +474,7 @@
       <w:tr>
         <w:tc>
           <w:tcPr>
-            <w:tcW w:type="dxa" w:w="4680"/>
+            <w:tcW w:type="dxa" w:w="2550"/>
             <w:tcBorders>
               <w:top w:val="single" w:color="D0D0CE" w:sz="1"/>
               <w:left w:val="single" w:color="D0D0CE" w:sz="1"/>
@@ -500,7 +500,7 @@
         </w:tc>
         <w:tc>
           <w:tcPr>
-            <w:tcW w:type="dxa" w:w="4680"/>
+            <w:tcW w:type="dxa" w:w="6810"/>
             <w:tcBorders>
               <w:top w:val="single" w:color="D0D0CE" w:sz="1"/>
               <w:left w:val="single" w:color="D0D0CE" w:sz="1"/>
@@ -528,7 +528,7 @@
       <w:tr>
         <w:tc>
           <w:tcPr>
-            <w:tcW w:type="dxa" w:w="4680"/>
+            <w:tcW w:type="dxa" w:w="2550"/>
             <w:tcBorders>
               <w:top w:val="single" w:color="D0D0CE" w:sz="1"/>
               <w:left w:val="single" w:color="D0D0CE" w:sz="1"/>
@@ -554,7 +554,7 @@
         </w:tc>
         <w:tc>
           <w:tcPr>
-            <w:tcW w:type="dxa" w:w="4680"/>
+            <w:tcW w:type="dxa" w:w="6810"/>
             <w:tcBorders>
               <w:top w:val="single" w:color="D0D0CE" w:sz="1"/>
               <w:left w:val="single" w:color="D0D0CE" w:sz="1"/>
@@ -580,6 +580,14 @@
         </w:tc>
       </w:tr>
     </w:tbl>
+    <w:p>
+      <w:pPr>
+        <w:spacing w:after="120"/>
+      </w:pPr>
+      <w:r>
+        <w:t xml:space="preserve"/>
+      </w:r>
+    </w:p>
     <w:p>
       <w:pPr>
         <w:spacing w:after="120"/>
@@ -609,8 +617,8 @@
         </w:tblBorders>
       </w:tblPr>
       <w:tblGrid>
-        <w:gridCol w:w="4680"/>
-        <w:gridCol w:w="4680"/>
+        <w:gridCol w:w="3185"/>
+        <w:gridCol w:w="6175"/>
       </w:tblGrid>
       <w:tr>
         <w:trPr>
@@ -618,7 +626,7 @@
         </w:trPr>
         <w:tc>
           <w:tcPr>
-            <w:tcW w:type="dxa" w:w="4680"/>
+            <w:tcW w:type="dxa" w:w="3185"/>
             <w:tcBorders>
               <w:top w:val="single" w:color="D0D0CE" w:sz="1"/>
               <w:left w:val="single" w:color="D0D0CE" w:sz="1"/>
@@ -651,7 +659,7 @@
         </w:tc>
         <w:tc>
           <w:tcPr>
-            <w:tcW w:type="dxa" w:w="4680"/>
+            <w:tcW w:type="dxa" w:w="6175"/>
             <w:tcBorders>
               <w:top w:val="single" w:color="D0D0CE" w:sz="1"/>
               <w:left w:val="single" w:color="D0D0CE" w:sz="1"/>
@@ -686,7 +694,7 @@
       <w:tr>
         <w:tc>
           <w:tcPr>
-            <w:tcW w:type="dxa" w:w="4680"/>
+            <w:tcW w:type="dxa" w:w="3185"/>
             <w:tcBorders>
               <w:top w:val="single" w:color="D0D0CE" w:sz="1"/>
               <w:left w:val="single" w:color="D0D0CE" w:sz="1"/>
@@ -712,7 +720,7 @@
         </w:tc>
         <w:tc>
           <w:tcPr>
-            <w:tcW w:type="dxa" w:w="4680"/>
+            <w:tcW w:type="dxa" w:w="6175"/>
             <w:tcBorders>
               <w:top w:val="single" w:color="D0D0CE" w:sz="1"/>
               <w:left w:val="single" w:color="D0D0CE" w:sz="1"/>
@@ -740,7 +748,7 @@
       <w:tr>
         <w:tc>
           <w:tcPr>
-            <w:tcW w:type="dxa" w:w="4680"/>
+            <w:tcW w:type="dxa" w:w="3185"/>
             <w:tcBorders>
               <w:top w:val="single" w:color="D0D0CE" w:sz="1"/>
               <w:left w:val="single" w:color="D0D0CE" w:sz="1"/>
@@ -766,7 +774,7 @@
         </w:tc>
         <w:tc>
           <w:tcPr>
-            <w:tcW w:type="dxa" w:w="4680"/>
+            <w:tcW w:type="dxa" w:w="6175"/>
             <w:tcBorders>
               <w:top w:val="single" w:color="D0D0CE" w:sz="1"/>
               <w:left w:val="single" w:color="D0D0CE" w:sz="1"/>
@@ -794,7 +802,7 @@
       <w:tr>
         <w:tc>
           <w:tcPr>
-            <w:tcW w:type="dxa" w:w="4680"/>
+            <w:tcW w:type="dxa" w:w="3185"/>
             <w:tcBorders>
               <w:top w:val="single" w:color="D0D0CE" w:sz="1"/>
               <w:left w:val="single" w:color="D0D0CE" w:sz="1"/>
@@ -820,7 +828,7 @@
         </w:tc>
         <w:tc>
           <w:tcPr>
-            <w:tcW w:type="dxa" w:w="4680"/>
+            <w:tcW w:type="dxa" w:w="6175"/>
             <w:tcBorders>
               <w:top w:val="single" w:color="D0D0CE" w:sz="1"/>
               <w:left w:val="single" w:color="D0D0CE" w:sz="1"/>
@@ -848,7 +856,7 @@
       <w:tr>
         <w:tc>
           <w:tcPr>
-            <w:tcW w:type="dxa" w:w="4680"/>
+            <w:tcW w:type="dxa" w:w="3185"/>
             <w:tcBorders>
               <w:top w:val="single" w:color="D0D0CE" w:sz="1"/>
               <w:left w:val="single" w:color="D0D0CE" w:sz="1"/>
@@ -874,7 +882,7 @@
         </w:tc>
         <w:tc>
           <w:tcPr>
-            <w:tcW w:type="dxa" w:w="4680"/>
+            <w:tcW w:type="dxa" w:w="6175"/>
             <w:tcBorders>
               <w:top w:val="single" w:color="D0D0CE" w:sz="1"/>
               <w:left w:val="single" w:color="D0D0CE" w:sz="1"/>
@@ -902,6 +910,14 @@
     </w:tbl>
     <w:p>
       <w:pPr>
+        <w:spacing w:after="120"/>
+      </w:pPr>
+      <w:r>
+        <w:t xml:space="preserve"/>
+      </w:r>
+    </w:p>
+    <w:p>
+      <w:pPr>
         <w:pStyle w:val="Heading1"/>
       </w:pPr>
       <w:r>
@@ -921,7 +937,7 @@
         <w:spacing w:after="120"/>
       </w:pPr>
       <w:r>
-        <w:t xml:space="preserve">[Case Study] Design case study — a conversational AI companion for menopause and perimenopause support (author’s prior applied work). [Conference Outline] Conference talk outline — “Building Safe Conversational AI Agents for Healthcare.”</w:t>
+        <w:t xml:space="preserve">[Case Study] Eltayeb, Y. (2026). Menopause-support companion design case study. In SAFE-CARE public release repository, v1.0. Conefia. GitHub/Zenodo. https://doi.org/10.5281/zenodo.21330842 [Conference Outline] Eltayeb, Y. (2026). Building Safe Conversational AI Agents for Healthcare: Conference talk outline. In SAFE-CARE public release repository, v1.0. Conefia. GitHub/Zenodo. https://doi.org/10.5281/zenodo.21330842</w:t>
       </w:r>
     </w:p>
     <w:p>
@@ -1017,7 +1033,17 @@
         <w:t xml:space="preserve">How to cite:</w:t>
       </w:r>
       <w:r>
-        <w:t xml:space="preserve"> Eltayeb, Y. (2026). *SAFE-CARE: A Framework for Designing and Evaluating Safe Healthcare AI Agents*. Conefia. DOI: [Zenodo DOI].</w:t>
+        <w:t xml:space="preserve"> Eltayeb, Y. (2026). </w:t>
+      </w:r>
+      <w:r>
+        <w:rPr>
+          <w:i/>
+          <w:iCs/>
+        </w:rPr>
+        <w:t xml:space="preserve">SAFE-CARE: A Framework for Designing and Evaluating Safe Healthcare AI Agents</w:t>
+      </w:r>
+      <w:r>
+        <w:t xml:space="preserve">. Conefia. DOI: https://doi.org/10.5281/zenodo.21330159.</w:t>
       </w:r>
     </w:p>
     <w:p>

</xml_diff>

<commit_message>
v1.1: add NIST AI 600-1 (Generative AI Profile) to references; version bump
</commit_message>
<xml_diff>
--- a/release_assets/docx/01_SAFE-CARE_One_Pager.docx
+++ b/release_assets/docx/01_SAFE-CARE_One_Pager.docx
@@ -33,7 +33,7 @@
           <w:sz w:val="17"/>
           <w:szCs w:val="17"/>
         </w:rPr>
-        <w:t xml:space="preserve">SAFE-CARE Framework — authored by Yassen Eltayeb, Conefia · Version 1.0 · July 2026</w:t>
+        <w:t xml:space="preserve">SAFE-CARE Framework — authored by Yassen Eltayeb, Conefia · Version 1.1 · July 2026</w:t>
       </w:r>
     </w:p>
     <w:p>
@@ -993,7 +993,7 @@
         <w:t xml:space="preserve">Version:</w:t>
       </w:r>
       <w:r>
-        <w:t xml:space="preserve"> v1.0 · July 2026.</w:t>
+        <w:t xml:space="preserve"> v1.1 · July 2026.</w:t>
       </w:r>
     </w:p>
     <w:p>

</xml_diff>

<commit_message>
docs: cite Zenodo concept DOI (10.5281/zenodo.21330841); align repo name casing
</commit_message>
<xml_diff>
--- a/release_assets/docx/01_SAFE-CARE_One_Pager.docx
+++ b/release_assets/docx/01_SAFE-CARE_One_Pager.docx
@@ -937,7 +937,7 @@
         <w:spacing w:after="120"/>
       </w:pPr>
       <w:r>
-        <w:t xml:space="preserve">[Case Study] Eltayeb, Y. (2026). Menopause-support companion design case study. In SAFE-CARE public release repository, v1.0. Conefia. GitHub/Zenodo. https://doi.org/10.5281/zenodo.21330842 [Conference Outline] Eltayeb, Y. (2026). Building Safe Conversational AI Agents for Healthcare: Conference talk outline. In SAFE-CARE public release repository, v1.0. Conefia. GitHub/Zenodo. https://doi.org/10.5281/zenodo.21330842</w:t>
+        <w:t xml:space="preserve">[Case Study] Eltayeb, Y. (2026). Menopause-support companion design case study. In the SAFE-CARE public release repository. Conefia. GitHub/Zenodo. https://doi.org/10.5281/zenodo.21330841 [Conference Outline] Eltayeb, Y. (2026). Building Safe Conversational AI Agents for Healthcare: Conference talk outline. In the SAFE-CARE public release repository. Conefia. GitHub/Zenodo. https://doi.org/10.5281/zenodo.21330841</w:t>
       </w:r>
     </w:p>
     <w:p>
@@ -1043,7 +1043,7 @@
         <w:t xml:space="preserve">SAFE-CARE: A Framework for Designing and Evaluating Safe Healthcare AI Agents</w:t>
       </w:r>
       <w:r>
-        <w:t xml:space="preserve">. Conefia. DOI: https://doi.org/10.5281/zenodo.21330159.</w:t>
+        <w:t xml:space="preserve">. Conefia. DOI: https://doi.org/10.5281/zenodo.21330841.</w:t>
       </w:r>
     </w:p>
     <w:p>

</xml_diff>

<commit_message>
docs: replace orphaned companion-doc citations with Companion documents sections; name source files in references
</commit_message>
<xml_diff>
--- a/release_assets/docx/01_SAFE-CARE_One_Pager.docx
+++ b/release_assets/docx/01_SAFE-CARE_One_Pager.docx
@@ -934,10 +934,58 @@
     </w:p>
     <w:p>
       <w:pPr>
+        <w:pStyle w:val="Heading1"/>
+      </w:pPr>
+      <w:r>
+        <w:t xml:space="preserve">Companion documents</w:t>
+      </w:r>
+    </w:p>
+    <w:p>
+      <w:pPr>
         <w:spacing w:after="120"/>
       </w:pPr>
       <w:r>
-        <w:t xml:space="preserve">[Case Study] Eltayeb, Y. (2026). Menopause-support companion design case study. In the SAFE-CARE public release repository. Conefia. GitHub/Zenodo. https://doi.org/10.5281/zenodo.21330841 [Conference Outline] Eltayeb, Y. (2026). Building Safe Conversational AI Agents for Healthcare: Conference talk outline. In the SAFE-CARE public release repository. Conefia. GitHub/Zenodo. https://doi.org/10.5281/zenodo.21330841</w:t>
+        <w:t xml:space="preserve">Published alongside this one-pager in the SAFE-CARE public release repository (github.com/Conefia/SAFE-CARE · DOI 10.5281/zenodo.21330841):</w:t>
+      </w:r>
+    </w:p>
+    <w:p>
+      <w:pPr>
+        <w:pStyle w:val="ListParagraph"/>
+        <w:numPr>
+          <w:ilvl w:val="0"/>
+          <w:numId w:val="2"/>
+        </w:numPr>
+        <w:spacing w:after="40"/>
+      </w:pPr>
+      <w:r>
+        <w:rPr>
+          <w:b/>
+          <w:bCs/>
+        </w:rPr>
+        <w:t xml:space="preserve">Menopause-support companion design case study</w:t>
+      </w:r>
+      <w:r>
+        <w:t xml:space="preserve"> — the first applied case study of SAFE-CARE, based on the author's prior applied work and presented in anonymized form (docs/03_SAFE-CARE_Menopause-Support_Companion_Case_Study).</w:t>
+      </w:r>
+    </w:p>
+    <w:p>
+      <w:pPr>
+        <w:pStyle w:val="ListParagraph"/>
+        <w:numPr>
+          <w:ilvl w:val="0"/>
+          <w:numId w:val="2"/>
+        </w:numPr>
+        <w:spacing w:after="40"/>
+      </w:pPr>
+      <w:r>
+        <w:rPr>
+          <w:b/>
+          <w:bCs/>
+        </w:rPr>
+        <w:t xml:space="preserve">Building Safe Conversational AI Agents for Healthcare</w:t>
+      </w:r>
+      <w:r>
+        <w:t xml:space="preserve"> — conference talk outline (docs/09_SAFE-CARE_Conference_Talk_Deck_Outline).</w:t>
       </w:r>
     </w:p>
     <w:p>

</xml_diff>

<commit_message>
v1.2.0: editorial accuracy pass — neutral dissemination section, mitigation framing, proposed release criteria, WHO 2024 citation, rights clarification
</commit_message>
<xml_diff>
--- a/release_assets/docx/01_SAFE-CARE_One_Pager.docx
+++ b/release_assets/docx/01_SAFE-CARE_One_Pager.docx
@@ -33,7 +33,7 @@
           <w:sz w:val="17"/>
           <w:szCs w:val="17"/>
         </w:rPr>
-        <w:t xml:space="preserve">SAFE-CARE Framework — authored by Yassen Eltayeb, Conefia · Version 1.1 · July 2026</w:t>
+        <w:t xml:space="preserve">SAFE-CARE Framework — authored by Yassen Eltayeb, Conefia · Version 1.2.0 · July 2026</w:t>
       </w:r>
     </w:p>
     <w:p>
@@ -1021,7 +1021,7 @@
         <w:t xml:space="preserve">Author:</w:t>
       </w:r>
       <w:r>
-        <w:t xml:space="preserve"> Yassen Eltayeb — Conefia.</w:t>
+        <w:t xml:space="preserve"> Yassen Eltayeb.</w:t>
       </w:r>
     </w:p>
     <w:p>
@@ -1041,7 +1041,7 @@
         <w:t xml:space="preserve">Version:</w:t>
       </w:r>
       <w:r>
-        <w:t xml:space="preserve"> v1.1 · July 2026.</w:t>
+        <w:t xml:space="preserve"> 1.2.0 · July 2026.</w:t>
       </w:r>
     </w:p>
     <w:p>
@@ -1111,7 +1111,7 @@
         <w:t xml:space="preserve">Trademark:</w:t>
       </w:r>
       <w:r>
-        <w:t xml:space="preserve"> SAFE-CARE™ is a trademark of Yassen Eltayeb / Conefia.</w:t>
+        <w:t xml:space="preserve"> SAFE-CARE™ is a claimed unregistered trademark used by Conefia LLC in connection with its healthcare-AI framework and related services.</w:t>
       </w:r>
     </w:p>
     <w:p>
@@ -1131,7 +1131,7 @@
         <w:t xml:space="preserve">Copyright:</w:t>
       </w:r>
       <w:r>
-        <w:t xml:space="preserve"> © 2026 Yassen Eltayeb / Conefia.</w:t>
+        <w:t xml:space="preserve"> © 2026 Yassen Eltayeb.</w:t>
       </w:r>
     </w:p>
     <w:p>

</xml_diff>